<commit_message>
Identificação do modelo de IA: DeepSeek V4.1 Flash 1017
</commit_message>
<xml_diff>
--- a/pesquisa_prisoes-cautelares_2026-10-28.docx
+++ b/pesquisa_prisoes-cautelares_2026-10-28.docx
@@ -1430,7 +1430,7 @@
               <w:rPr>
                 <w:sz w:val="22"/>
               </w:rPr>
-              <w:t xml:space="preserve">Esta pesquisa foi elaborada com o auxílio de inteligência artificial (IA) — OpenCode, em terminal, com o modelo DeepSeek V4.1 — e de scripts de conferência. Cabe ao leitor consultar as fontes primárias antes de qualquer uso.</w:t>
+              <w:t xml:space="preserve">Esta pesquisa foi elaborada com o auxílio de inteligência artificial (IA) — OpenCode, em terminal, com o modelo DeepSeek V4.1 Flash 1017 — e de scripts de conferência. Cabe ao leitor consultar as fontes primárias antes de qualquer uso.</w:t>
             </w:r>
           </w:p>
           <w:p>
@@ -1606,7 +1606,7 @@
         <w:t xml:space="preserve"> </w:t>
       </w:r>
       <w:r>
-        <w:t xml:space="preserve">consulta às fontes e redação assistidas por IA generativa, em terminal, com o OpenCode e o modelo DeepSeek V4.1. A conferência das fontes primárias cabe ao leitor (ver seção 14).</w:t>
+        <w:t xml:space="preserve">consulta às fontes e redação assistidas por IA generativa, em terminal, com o OpenCode e o modelo DeepSeek V4.1 Flash 1017. A conferência das fontes primárias cabe ao leitor (ver seção 14).</w:t>
       </w:r>
     </w:p>
     <w:p>

</xml_diff>